<commit_message>
Update BRRI Win2024 data collection files
- Updated the existing Word document for the BRRI Win2024 data collection form.
- Added a new Jupyter notebook for creating Google Drive folders for photo collection, streamlining the data collection process.
- Modified the data collection script to improve photo example handling and clarify file naming conventions.
</commit_message>
<xml_diff>
--- a/docs/BRRI_Win2024_Data_Collection_Form.docx
+++ b/docs/BRRI_Win2024_Data_Collection_Form.docx
@@ -2867,9 +2867,11 @@
         <w:br/>
         <w:t xml:space="preserve">   … (নিচের টেবিলের ‘ফোল্ডার নাম’ কলাম)</w:t>
         <w:br/>
-        <w:t>৩. ফাইল নাম: NN_english-name.jpg (উদাহরণ: 03_B65_belt_marking.jpg)</w:t>
+        <w:t>৩. ফাইল নাম: NN_description.jpg — এক ফোল্ডারে একাধিক ছবি OK (উদাহরণ: 10_b65_marking.jpg, 10_belt_worn.jpg)</w:t>
         <w:br/>
-        <w:t>৪. ছবি তোলার পর ‘Google Drive লিংক’ কলামে ফাইল বা ফোল্ডার লিংক দিন।</w:t>
+        <w:t>৪. ‘ফাইল নাম’ কলামে শুধু মূল/সেরা ছবির নাম; বাকি ছবি Drive ফোল্ডারেই থাকবে</w:t>
+        <w:br/>
+        <w:t>৫. ছবি তোলার পর ‘Google Drive লিংক’ কলামে ফোল্ডার লিংক দিন।</w:t>
       </w:r>
     </w:p>
     <w:p>
@@ -2884,20 +2886,19 @@
         <w:tblLook w:firstColumn="1" w:firstRow="1" w:lastColumn="0" w:lastRow="0" w:noHBand="0" w:noVBand="1" w:val="04A0"/>
       </w:tblPr>
       <w:tblGrid>
-        <w:gridCol w:w="1152"/>
-        <w:gridCol w:w="1152"/>
-        <w:gridCol w:w="1152"/>
-        <w:gridCol w:w="1152"/>
-        <w:gridCol w:w="1152"/>
-        <w:gridCol w:w="1152"/>
-        <w:gridCol w:w="1152"/>
-        <w:gridCol w:w="1152"/>
-        <w:gridCol w:w="1152"/>
+        <w:gridCol w:w="1296"/>
+        <w:gridCol w:w="1296"/>
+        <w:gridCol w:w="1296"/>
+        <w:gridCol w:w="1296"/>
+        <w:gridCol w:w="1296"/>
+        <w:gridCol w:w="1296"/>
+        <w:gridCol w:w="1296"/>
+        <w:gridCol w:w="1296"/>
       </w:tblGrid>
       <w:tr>
         <w:tc>
           <w:tcPr>
-            <w:tcW w:type="dxa" w:w="1152"/>
+            <w:tcW w:type="dxa" w:w="1296"/>
             <w:shd w:fill="D9E2F3"/>
           </w:tcPr>
           <w:p>
@@ -2911,7 +2912,7 @@
         </w:tc>
         <w:tc>
           <w:tcPr>
-            <w:tcW w:type="dxa" w:w="1152"/>
+            <w:tcW w:type="dxa" w:w="1296"/>
             <w:shd w:fill="D9E2F3"/>
           </w:tcPr>
           <w:p>
@@ -2925,7 +2926,7 @@
         </w:tc>
         <w:tc>
           <w:tcPr>
-            <w:tcW w:type="dxa" w:w="1152"/>
+            <w:tcW w:type="dxa" w:w="1296"/>
             <w:shd w:fill="D9E2F3"/>
           </w:tcPr>
           <w:p>
@@ -2939,7 +2940,7 @@
         </w:tc>
         <w:tc>
           <w:tcPr>
-            <w:tcW w:type="dxa" w:w="1152"/>
+            <w:tcW w:type="dxa" w:w="1296"/>
             <w:shd w:fill="D9E2F3"/>
           </w:tcPr>
           <w:p>
@@ -2953,7 +2954,7 @@
         </w:tc>
         <w:tc>
           <w:tcPr>
-            <w:tcW w:type="dxa" w:w="1152"/>
+            <w:tcW w:type="dxa" w:w="1296"/>
             <w:shd w:fill="D9E2F3"/>
           </w:tcPr>
           <w:p>
@@ -2967,7 +2968,7 @@
         </w:tc>
         <w:tc>
           <w:tcPr>
-            <w:tcW w:type="dxa" w:w="1152"/>
+            <w:tcW w:type="dxa" w:w="1296"/>
             <w:shd w:fill="D9E2F3"/>
           </w:tcPr>
           <w:p>
@@ -2975,13 +2976,13 @@
               <w:rPr>
                 <w:sz w:val="18"/>
               </w:rPr>
-              <w:t>ফাইল নাম</w:t>
-            </w:r>
-          </w:p>
-        </w:tc>
-        <w:tc>
-          <w:tcPr>
-            <w:tcW w:type="dxa" w:w="1152"/>
+              <w:t>ফাইল নাম (মূল ছবি)</w:t>
+            </w:r>
+          </w:p>
+        </w:tc>
+        <w:tc>
+          <w:tcPr>
+            <w:tcW w:type="dxa" w:w="1296"/>
             <w:shd w:fill="D9E2F3"/>
           </w:tcPr>
           <w:p>
@@ -2989,27 +2990,13 @@
               <w:rPr>
                 <w:sz w:val="18"/>
               </w:rPr>
-              <w:t>অবস্থা</w:t>
-            </w:r>
-          </w:p>
-        </w:tc>
-        <w:tc>
-          <w:tcPr>
-            <w:tcW w:type="dxa" w:w="1152"/>
-            <w:shd w:fill="D9E2F3"/>
-          </w:tcPr>
-          <w:p>
-            <w:r>
-              <w:rPr>
-                <w:sz w:val="18"/>
-              </w:rPr>
               <w:t>Google Drive লিংক</w:t>
             </w:r>
           </w:p>
         </w:tc>
         <w:tc>
           <w:tcPr>
-            <w:tcW w:type="dxa" w:w="1152"/>
+            <w:tcW w:type="dxa" w:w="1296"/>
             <w:shd w:fill="D9E2F3"/>
           </w:tcPr>
           <w:p>
@@ -3025,7 +3012,7 @@
       <w:tr>
         <w:tc>
           <w:tcPr>
-            <w:tcW w:type="dxa" w:w="1152"/>
+            <w:tcW w:type="dxa" w:w="1296"/>
           </w:tcPr>
           <w:p>
             <w:r>
@@ -3038,7 +3025,7 @@
         </w:tc>
         <w:tc>
           <w:tcPr>
-            <w:tcW w:type="dxa" w:w="1152"/>
+            <w:tcW w:type="dxa" w:w="1296"/>
           </w:tcPr>
           <w:p>
             <w:r>
@@ -3051,7 +3038,7 @@
         </w:tc>
         <w:tc>
           <w:tcPr>
-            <w:tcW w:type="dxa" w:w="1152"/>
+            <w:tcW w:type="dxa" w:w="1296"/>
           </w:tcPr>
           <w:p>
             <w:r>
@@ -3064,19 +3051,19 @@
         </w:tc>
         <w:tc>
           <w:tcPr>
-            <w:tcW w:type="dxa" w:w="1152"/>
-          </w:tcPr>
-          <w:p>
-            <w:r>
-              <w:rPr>
-                <w:sz w:val="18"/>
-              </w:rPr>
-            </w:r>
-          </w:p>
-        </w:tc>
-        <w:tc>
-          <w:tcPr>
-            <w:tcW w:type="dxa" w:w="1152"/>
+            <w:tcW w:type="dxa" w:w="1296"/>
+          </w:tcPr>
+          <w:p>
+            <w:r>
+              <w:rPr>
+                <w:sz w:val="18"/>
+              </w:rPr>
+            </w:r>
+          </w:p>
+        </w:tc>
+        <w:tc>
+          <w:tcPr>
+            <w:tcW w:type="dxa" w:w="1296"/>
           </w:tcPr>
           <w:p>
             <w:r>
@@ -3089,7 +3076,7 @@
         </w:tc>
         <w:tc>
           <w:tcPr>
-            <w:tcW w:type="dxa" w:w="1152"/>
+            <w:tcW w:type="dxa" w:w="1296"/>
           </w:tcPr>
           <w:p>
             <w:r>
@@ -3102,31 +3089,19 @@
         </w:tc>
         <w:tc>
           <w:tcPr>
-            <w:tcW w:type="dxa" w:w="1152"/>
-          </w:tcPr>
-          <w:p>
-            <w:r>
-              <w:rPr>
-                <w:sz w:val="18"/>
-              </w:rPr>
-            </w:r>
-          </w:p>
-        </w:tc>
-        <w:tc>
-          <w:tcPr>
-            <w:tcW w:type="dxa" w:w="1152"/>
-          </w:tcPr>
-          <w:p>
-            <w:r>
-              <w:rPr>
-                <w:sz w:val="18"/>
-              </w:rPr>
-            </w:r>
-          </w:p>
-        </w:tc>
-        <w:tc>
-          <w:tcPr>
-            <w:tcW w:type="dxa" w:w="1152"/>
+            <w:tcW w:type="dxa" w:w="1296"/>
+          </w:tcPr>
+          <w:p>
+            <w:r>
+              <w:rPr>
+                <w:sz w:val="18"/>
+              </w:rPr>
+            </w:r>
+          </w:p>
+        </w:tc>
+        <w:tc>
+          <w:tcPr>
+            <w:tcW w:type="dxa" w:w="1296"/>
           </w:tcPr>
           <w:p>
             <w:r>
@@ -3140,7 +3115,7 @@
       <w:tr>
         <w:tc>
           <w:tcPr>
-            <w:tcW w:type="dxa" w:w="1152"/>
+            <w:tcW w:type="dxa" w:w="1296"/>
           </w:tcPr>
           <w:p>
             <w:r>
@@ -3153,7 +3128,7 @@
         </w:tc>
         <w:tc>
           <w:tcPr>
-            <w:tcW w:type="dxa" w:w="1152"/>
+            <w:tcW w:type="dxa" w:w="1296"/>
           </w:tcPr>
           <w:p>
             <w:r>
@@ -3166,7 +3141,7 @@
         </w:tc>
         <w:tc>
           <w:tcPr>
-            <w:tcW w:type="dxa" w:w="1152"/>
+            <w:tcW w:type="dxa" w:w="1296"/>
           </w:tcPr>
           <w:p>
             <w:r>
@@ -3179,19 +3154,19 @@
         </w:tc>
         <w:tc>
           <w:tcPr>
-            <w:tcW w:type="dxa" w:w="1152"/>
-          </w:tcPr>
-          <w:p>
-            <w:r>
-              <w:rPr>
-                <w:sz w:val="18"/>
-              </w:rPr>
-            </w:r>
-          </w:p>
-        </w:tc>
-        <w:tc>
-          <w:tcPr>
-            <w:tcW w:type="dxa" w:w="1152"/>
+            <w:tcW w:type="dxa" w:w="1296"/>
+          </w:tcPr>
+          <w:p>
+            <w:r>
+              <w:rPr>
+                <w:sz w:val="18"/>
+              </w:rPr>
+            </w:r>
+          </w:p>
+        </w:tc>
+        <w:tc>
+          <w:tcPr>
+            <w:tcW w:type="dxa" w:w="1296"/>
           </w:tcPr>
           <w:p>
             <w:r>
@@ -3204,7 +3179,7 @@
         </w:tc>
         <w:tc>
           <w:tcPr>
-            <w:tcW w:type="dxa" w:w="1152"/>
+            <w:tcW w:type="dxa" w:w="1296"/>
           </w:tcPr>
           <w:p>
             <w:r>
@@ -3217,31 +3192,19 @@
         </w:tc>
         <w:tc>
           <w:tcPr>
-            <w:tcW w:type="dxa" w:w="1152"/>
-          </w:tcPr>
-          <w:p>
-            <w:r>
-              <w:rPr>
-                <w:sz w:val="18"/>
-              </w:rPr>
-            </w:r>
-          </w:p>
-        </w:tc>
-        <w:tc>
-          <w:tcPr>
-            <w:tcW w:type="dxa" w:w="1152"/>
-          </w:tcPr>
-          <w:p>
-            <w:r>
-              <w:rPr>
-                <w:sz w:val="18"/>
-              </w:rPr>
-            </w:r>
-          </w:p>
-        </w:tc>
-        <w:tc>
-          <w:tcPr>
-            <w:tcW w:type="dxa" w:w="1152"/>
+            <w:tcW w:type="dxa" w:w="1296"/>
+          </w:tcPr>
+          <w:p>
+            <w:r>
+              <w:rPr>
+                <w:sz w:val="18"/>
+              </w:rPr>
+            </w:r>
+          </w:p>
+        </w:tc>
+        <w:tc>
+          <w:tcPr>
+            <w:tcW w:type="dxa" w:w="1296"/>
           </w:tcPr>
           <w:p>
             <w:r>
@@ -3255,7 +3218,7 @@
       <w:tr>
         <w:tc>
           <w:tcPr>
-            <w:tcW w:type="dxa" w:w="1152"/>
+            <w:tcW w:type="dxa" w:w="1296"/>
           </w:tcPr>
           <w:p>
             <w:r>
@@ -3268,7 +3231,7 @@
         </w:tc>
         <w:tc>
           <w:tcPr>
-            <w:tcW w:type="dxa" w:w="1152"/>
+            <w:tcW w:type="dxa" w:w="1296"/>
           </w:tcPr>
           <w:p>
             <w:r>
@@ -3281,7 +3244,7 @@
         </w:tc>
         <w:tc>
           <w:tcPr>
-            <w:tcW w:type="dxa" w:w="1152"/>
+            <w:tcW w:type="dxa" w:w="1296"/>
           </w:tcPr>
           <w:p>
             <w:r>
@@ -3294,19 +3257,19 @@
         </w:tc>
         <w:tc>
           <w:tcPr>
-            <w:tcW w:type="dxa" w:w="1152"/>
-          </w:tcPr>
-          <w:p>
-            <w:r>
-              <w:rPr>
-                <w:sz w:val="18"/>
-              </w:rPr>
-            </w:r>
-          </w:p>
-        </w:tc>
-        <w:tc>
-          <w:tcPr>
-            <w:tcW w:type="dxa" w:w="1152"/>
+            <w:tcW w:type="dxa" w:w="1296"/>
+          </w:tcPr>
+          <w:p>
+            <w:r>
+              <w:rPr>
+                <w:sz w:val="18"/>
+              </w:rPr>
+            </w:r>
+          </w:p>
+        </w:tc>
+        <w:tc>
+          <w:tcPr>
+            <w:tcW w:type="dxa" w:w="1296"/>
           </w:tcPr>
           <w:p>
             <w:r>
@@ -3319,7 +3282,7 @@
         </w:tc>
         <w:tc>
           <w:tcPr>
-            <w:tcW w:type="dxa" w:w="1152"/>
+            <w:tcW w:type="dxa" w:w="1296"/>
           </w:tcPr>
           <w:p>
             <w:r>
@@ -3332,31 +3295,19 @@
         </w:tc>
         <w:tc>
           <w:tcPr>
-            <w:tcW w:type="dxa" w:w="1152"/>
-          </w:tcPr>
-          <w:p>
-            <w:r>
-              <w:rPr>
-                <w:sz w:val="18"/>
-              </w:rPr>
-            </w:r>
-          </w:p>
-        </w:tc>
-        <w:tc>
-          <w:tcPr>
-            <w:tcW w:type="dxa" w:w="1152"/>
-          </w:tcPr>
-          <w:p>
-            <w:r>
-              <w:rPr>
-                <w:sz w:val="18"/>
-              </w:rPr>
-            </w:r>
-          </w:p>
-        </w:tc>
-        <w:tc>
-          <w:tcPr>
-            <w:tcW w:type="dxa" w:w="1152"/>
+            <w:tcW w:type="dxa" w:w="1296"/>
+          </w:tcPr>
+          <w:p>
+            <w:r>
+              <w:rPr>
+                <w:sz w:val="18"/>
+              </w:rPr>
+            </w:r>
+          </w:p>
+        </w:tc>
+        <w:tc>
+          <w:tcPr>
+            <w:tcW w:type="dxa" w:w="1296"/>
           </w:tcPr>
           <w:p>
             <w:r>
@@ -3370,7 +3321,7 @@
       <w:tr>
         <w:tc>
           <w:tcPr>
-            <w:tcW w:type="dxa" w:w="1152"/>
+            <w:tcW w:type="dxa" w:w="1296"/>
           </w:tcPr>
           <w:p>
             <w:r>
@@ -3383,7 +3334,7 @@
         </w:tc>
         <w:tc>
           <w:tcPr>
-            <w:tcW w:type="dxa" w:w="1152"/>
+            <w:tcW w:type="dxa" w:w="1296"/>
           </w:tcPr>
           <w:p>
             <w:r>
@@ -3396,7 +3347,7 @@
         </w:tc>
         <w:tc>
           <w:tcPr>
-            <w:tcW w:type="dxa" w:w="1152"/>
+            <w:tcW w:type="dxa" w:w="1296"/>
           </w:tcPr>
           <w:p>
             <w:r>
@@ -3409,19 +3360,19 @@
         </w:tc>
         <w:tc>
           <w:tcPr>
-            <w:tcW w:type="dxa" w:w="1152"/>
-          </w:tcPr>
-          <w:p>
-            <w:r>
-              <w:rPr>
-                <w:sz w:val="18"/>
-              </w:rPr>
-            </w:r>
-          </w:p>
-        </w:tc>
-        <w:tc>
-          <w:tcPr>
-            <w:tcW w:type="dxa" w:w="1152"/>
+            <w:tcW w:type="dxa" w:w="1296"/>
+          </w:tcPr>
+          <w:p>
+            <w:r>
+              <w:rPr>
+                <w:sz w:val="18"/>
+              </w:rPr>
+            </w:r>
+          </w:p>
+        </w:tc>
+        <w:tc>
+          <w:tcPr>
+            <w:tcW w:type="dxa" w:w="1296"/>
           </w:tcPr>
           <w:p>
             <w:r>
@@ -3434,7 +3385,7 @@
         </w:tc>
         <w:tc>
           <w:tcPr>
-            <w:tcW w:type="dxa" w:w="1152"/>
+            <w:tcW w:type="dxa" w:w="1296"/>
           </w:tcPr>
           <w:p>
             <w:r>
@@ -3447,31 +3398,19 @@
         </w:tc>
         <w:tc>
           <w:tcPr>
-            <w:tcW w:type="dxa" w:w="1152"/>
-          </w:tcPr>
-          <w:p>
-            <w:r>
-              <w:rPr>
-                <w:sz w:val="18"/>
-              </w:rPr>
-            </w:r>
-          </w:p>
-        </w:tc>
-        <w:tc>
-          <w:tcPr>
-            <w:tcW w:type="dxa" w:w="1152"/>
-          </w:tcPr>
-          <w:p>
-            <w:r>
-              <w:rPr>
-                <w:sz w:val="18"/>
-              </w:rPr>
-            </w:r>
-          </w:p>
-        </w:tc>
-        <w:tc>
-          <w:tcPr>
-            <w:tcW w:type="dxa" w:w="1152"/>
+            <w:tcW w:type="dxa" w:w="1296"/>
+          </w:tcPr>
+          <w:p>
+            <w:r>
+              <w:rPr>
+                <w:sz w:val="18"/>
+              </w:rPr>
+            </w:r>
+          </w:p>
+        </w:tc>
+        <w:tc>
+          <w:tcPr>
+            <w:tcW w:type="dxa" w:w="1296"/>
           </w:tcPr>
           <w:p>
             <w:r>
@@ -3485,7 +3424,7 @@
       <w:tr>
         <w:tc>
           <w:tcPr>
-            <w:tcW w:type="dxa" w:w="1152"/>
+            <w:tcW w:type="dxa" w:w="1296"/>
           </w:tcPr>
           <w:p>
             <w:r>
@@ -3498,7 +3437,7 @@
         </w:tc>
         <w:tc>
           <w:tcPr>
-            <w:tcW w:type="dxa" w:w="1152"/>
+            <w:tcW w:type="dxa" w:w="1296"/>
           </w:tcPr>
           <w:p>
             <w:r>
@@ -3511,7 +3450,7 @@
         </w:tc>
         <w:tc>
           <w:tcPr>
-            <w:tcW w:type="dxa" w:w="1152"/>
+            <w:tcW w:type="dxa" w:w="1296"/>
           </w:tcPr>
           <w:p>
             <w:r>
@@ -3524,19 +3463,19 @@
         </w:tc>
         <w:tc>
           <w:tcPr>
-            <w:tcW w:type="dxa" w:w="1152"/>
-          </w:tcPr>
-          <w:p>
-            <w:r>
-              <w:rPr>
-                <w:sz w:val="18"/>
-              </w:rPr>
-            </w:r>
-          </w:p>
-        </w:tc>
-        <w:tc>
-          <w:tcPr>
-            <w:tcW w:type="dxa" w:w="1152"/>
+            <w:tcW w:type="dxa" w:w="1296"/>
+          </w:tcPr>
+          <w:p>
+            <w:r>
+              <w:rPr>
+                <w:sz w:val="18"/>
+              </w:rPr>
+            </w:r>
+          </w:p>
+        </w:tc>
+        <w:tc>
+          <w:tcPr>
+            <w:tcW w:type="dxa" w:w="1296"/>
           </w:tcPr>
           <w:p>
             <w:r>
@@ -3549,7 +3488,7 @@
         </w:tc>
         <w:tc>
           <w:tcPr>
-            <w:tcW w:type="dxa" w:w="1152"/>
+            <w:tcW w:type="dxa" w:w="1296"/>
           </w:tcPr>
           <w:p>
             <w:r>
@@ -3562,31 +3501,19 @@
         </w:tc>
         <w:tc>
           <w:tcPr>
-            <w:tcW w:type="dxa" w:w="1152"/>
-          </w:tcPr>
-          <w:p>
-            <w:r>
-              <w:rPr>
-                <w:sz w:val="18"/>
-              </w:rPr>
-            </w:r>
-          </w:p>
-        </w:tc>
-        <w:tc>
-          <w:tcPr>
-            <w:tcW w:type="dxa" w:w="1152"/>
-          </w:tcPr>
-          <w:p>
-            <w:r>
-              <w:rPr>
-                <w:sz w:val="18"/>
-              </w:rPr>
-            </w:r>
-          </w:p>
-        </w:tc>
-        <w:tc>
-          <w:tcPr>
-            <w:tcW w:type="dxa" w:w="1152"/>
+            <w:tcW w:type="dxa" w:w="1296"/>
+          </w:tcPr>
+          <w:p>
+            <w:r>
+              <w:rPr>
+                <w:sz w:val="18"/>
+              </w:rPr>
+            </w:r>
+          </w:p>
+        </w:tc>
+        <w:tc>
+          <w:tcPr>
+            <w:tcW w:type="dxa" w:w="1296"/>
           </w:tcPr>
           <w:p>
             <w:r>
@@ -3600,7 +3527,7 @@
       <w:tr>
         <w:tc>
           <w:tcPr>
-            <w:tcW w:type="dxa" w:w="1152"/>
+            <w:tcW w:type="dxa" w:w="1296"/>
           </w:tcPr>
           <w:p>
             <w:r>
@@ -3613,7 +3540,7 @@
         </w:tc>
         <w:tc>
           <w:tcPr>
-            <w:tcW w:type="dxa" w:w="1152"/>
+            <w:tcW w:type="dxa" w:w="1296"/>
           </w:tcPr>
           <w:p>
             <w:r>
@@ -3626,7 +3553,7 @@
         </w:tc>
         <w:tc>
           <w:tcPr>
-            <w:tcW w:type="dxa" w:w="1152"/>
+            <w:tcW w:type="dxa" w:w="1296"/>
           </w:tcPr>
           <w:p>
             <w:r>
@@ -3639,19 +3566,19 @@
         </w:tc>
         <w:tc>
           <w:tcPr>
-            <w:tcW w:type="dxa" w:w="1152"/>
-          </w:tcPr>
-          <w:p>
-            <w:r>
-              <w:rPr>
-                <w:sz w:val="18"/>
-              </w:rPr>
-            </w:r>
-          </w:p>
-        </w:tc>
-        <w:tc>
-          <w:tcPr>
-            <w:tcW w:type="dxa" w:w="1152"/>
+            <w:tcW w:type="dxa" w:w="1296"/>
+          </w:tcPr>
+          <w:p>
+            <w:r>
+              <w:rPr>
+                <w:sz w:val="18"/>
+              </w:rPr>
+            </w:r>
+          </w:p>
+        </w:tc>
+        <w:tc>
+          <w:tcPr>
+            <w:tcW w:type="dxa" w:w="1296"/>
           </w:tcPr>
           <w:p>
             <w:r>
@@ -3664,7 +3591,7 @@
         </w:tc>
         <w:tc>
           <w:tcPr>
-            <w:tcW w:type="dxa" w:w="1152"/>
+            <w:tcW w:type="dxa" w:w="1296"/>
           </w:tcPr>
           <w:p>
             <w:r>
@@ -3677,31 +3604,19 @@
         </w:tc>
         <w:tc>
           <w:tcPr>
-            <w:tcW w:type="dxa" w:w="1152"/>
-          </w:tcPr>
-          <w:p>
-            <w:r>
-              <w:rPr>
-                <w:sz w:val="18"/>
-              </w:rPr>
-            </w:r>
-          </w:p>
-        </w:tc>
-        <w:tc>
-          <w:tcPr>
-            <w:tcW w:type="dxa" w:w="1152"/>
-          </w:tcPr>
-          <w:p>
-            <w:r>
-              <w:rPr>
-                <w:sz w:val="18"/>
-              </w:rPr>
-            </w:r>
-          </w:p>
-        </w:tc>
-        <w:tc>
-          <w:tcPr>
-            <w:tcW w:type="dxa" w:w="1152"/>
+            <w:tcW w:type="dxa" w:w="1296"/>
+          </w:tcPr>
+          <w:p>
+            <w:r>
+              <w:rPr>
+                <w:sz w:val="18"/>
+              </w:rPr>
+            </w:r>
+          </w:p>
+        </w:tc>
+        <w:tc>
+          <w:tcPr>
+            <w:tcW w:type="dxa" w:w="1296"/>
           </w:tcPr>
           <w:p>
             <w:r>
@@ -3715,7 +3630,7 @@
       <w:tr>
         <w:tc>
           <w:tcPr>
-            <w:tcW w:type="dxa" w:w="1152"/>
+            <w:tcW w:type="dxa" w:w="1296"/>
           </w:tcPr>
           <w:p>
             <w:r>
@@ -3728,7 +3643,7 @@
         </w:tc>
         <w:tc>
           <w:tcPr>
-            <w:tcW w:type="dxa" w:w="1152"/>
+            <w:tcW w:type="dxa" w:w="1296"/>
           </w:tcPr>
           <w:p>
             <w:r>
@@ -3741,7 +3656,7 @@
         </w:tc>
         <w:tc>
           <w:tcPr>
-            <w:tcW w:type="dxa" w:w="1152"/>
+            <w:tcW w:type="dxa" w:w="1296"/>
           </w:tcPr>
           <w:p>
             <w:r>
@@ -3754,19 +3669,19 @@
         </w:tc>
         <w:tc>
           <w:tcPr>
-            <w:tcW w:type="dxa" w:w="1152"/>
-          </w:tcPr>
-          <w:p>
-            <w:r>
-              <w:rPr>
-                <w:sz w:val="18"/>
-              </w:rPr>
-            </w:r>
-          </w:p>
-        </w:tc>
-        <w:tc>
-          <w:tcPr>
-            <w:tcW w:type="dxa" w:w="1152"/>
+            <w:tcW w:type="dxa" w:w="1296"/>
+          </w:tcPr>
+          <w:p>
+            <w:r>
+              <w:rPr>
+                <w:sz w:val="18"/>
+              </w:rPr>
+            </w:r>
+          </w:p>
+        </w:tc>
+        <w:tc>
+          <w:tcPr>
+            <w:tcW w:type="dxa" w:w="1296"/>
           </w:tcPr>
           <w:p>
             <w:r>
@@ -3779,7 +3694,7 @@
         </w:tc>
         <w:tc>
           <w:tcPr>
-            <w:tcW w:type="dxa" w:w="1152"/>
+            <w:tcW w:type="dxa" w:w="1296"/>
           </w:tcPr>
           <w:p>
             <w:r>
@@ -3792,31 +3707,19 @@
         </w:tc>
         <w:tc>
           <w:tcPr>
-            <w:tcW w:type="dxa" w:w="1152"/>
-          </w:tcPr>
-          <w:p>
-            <w:r>
-              <w:rPr>
-                <w:sz w:val="18"/>
-              </w:rPr>
-            </w:r>
-          </w:p>
-        </w:tc>
-        <w:tc>
-          <w:tcPr>
-            <w:tcW w:type="dxa" w:w="1152"/>
-          </w:tcPr>
-          <w:p>
-            <w:r>
-              <w:rPr>
-                <w:sz w:val="18"/>
-              </w:rPr>
-            </w:r>
-          </w:p>
-        </w:tc>
-        <w:tc>
-          <w:tcPr>
-            <w:tcW w:type="dxa" w:w="1152"/>
+            <w:tcW w:type="dxa" w:w="1296"/>
+          </w:tcPr>
+          <w:p>
+            <w:r>
+              <w:rPr>
+                <w:sz w:val="18"/>
+              </w:rPr>
+            </w:r>
+          </w:p>
+        </w:tc>
+        <w:tc>
+          <w:tcPr>
+            <w:tcW w:type="dxa" w:w="1296"/>
           </w:tcPr>
           <w:p>
             <w:r>
@@ -3830,7 +3733,7 @@
       <w:tr>
         <w:tc>
           <w:tcPr>
-            <w:tcW w:type="dxa" w:w="1152"/>
+            <w:tcW w:type="dxa" w:w="1296"/>
           </w:tcPr>
           <w:p>
             <w:r>
@@ -3843,7 +3746,7 @@
         </w:tc>
         <w:tc>
           <w:tcPr>
-            <w:tcW w:type="dxa" w:w="1152"/>
+            <w:tcW w:type="dxa" w:w="1296"/>
           </w:tcPr>
           <w:p>
             <w:r>
@@ -3856,7 +3759,7 @@
         </w:tc>
         <w:tc>
           <w:tcPr>
-            <w:tcW w:type="dxa" w:w="1152"/>
+            <w:tcW w:type="dxa" w:w="1296"/>
           </w:tcPr>
           <w:p>
             <w:r>
@@ -3869,19 +3772,19 @@
         </w:tc>
         <w:tc>
           <w:tcPr>
-            <w:tcW w:type="dxa" w:w="1152"/>
-          </w:tcPr>
-          <w:p>
-            <w:r>
-              <w:rPr>
-                <w:sz w:val="18"/>
-              </w:rPr>
-            </w:r>
-          </w:p>
-        </w:tc>
-        <w:tc>
-          <w:tcPr>
-            <w:tcW w:type="dxa" w:w="1152"/>
+            <w:tcW w:type="dxa" w:w="1296"/>
+          </w:tcPr>
+          <w:p>
+            <w:r>
+              <w:rPr>
+                <w:sz w:val="18"/>
+              </w:rPr>
+            </w:r>
+          </w:p>
+        </w:tc>
+        <w:tc>
+          <w:tcPr>
+            <w:tcW w:type="dxa" w:w="1296"/>
           </w:tcPr>
           <w:p>
             <w:r>
@@ -3894,7 +3797,7 @@
         </w:tc>
         <w:tc>
           <w:tcPr>
-            <w:tcW w:type="dxa" w:w="1152"/>
+            <w:tcW w:type="dxa" w:w="1296"/>
           </w:tcPr>
           <w:p>
             <w:r>
@@ -3907,31 +3810,19 @@
         </w:tc>
         <w:tc>
           <w:tcPr>
-            <w:tcW w:type="dxa" w:w="1152"/>
-          </w:tcPr>
-          <w:p>
-            <w:r>
-              <w:rPr>
-                <w:sz w:val="18"/>
-              </w:rPr>
-            </w:r>
-          </w:p>
-        </w:tc>
-        <w:tc>
-          <w:tcPr>
-            <w:tcW w:type="dxa" w:w="1152"/>
-          </w:tcPr>
-          <w:p>
-            <w:r>
-              <w:rPr>
-                <w:sz w:val="18"/>
-              </w:rPr>
-            </w:r>
-          </w:p>
-        </w:tc>
-        <w:tc>
-          <w:tcPr>
-            <w:tcW w:type="dxa" w:w="1152"/>
+            <w:tcW w:type="dxa" w:w="1296"/>
+          </w:tcPr>
+          <w:p>
+            <w:r>
+              <w:rPr>
+                <w:sz w:val="18"/>
+              </w:rPr>
+            </w:r>
+          </w:p>
+        </w:tc>
+        <w:tc>
+          <w:tcPr>
+            <w:tcW w:type="dxa" w:w="1296"/>
           </w:tcPr>
           <w:p>
             <w:r>
@@ -3945,7 +3836,7 @@
       <w:tr>
         <w:tc>
           <w:tcPr>
-            <w:tcW w:type="dxa" w:w="1152"/>
+            <w:tcW w:type="dxa" w:w="1296"/>
           </w:tcPr>
           <w:p>
             <w:r>
@@ -3958,7 +3849,7 @@
         </w:tc>
         <w:tc>
           <w:tcPr>
-            <w:tcW w:type="dxa" w:w="1152"/>
+            <w:tcW w:type="dxa" w:w="1296"/>
           </w:tcPr>
           <w:p>
             <w:r>
@@ -3971,7 +3862,7 @@
         </w:tc>
         <w:tc>
           <w:tcPr>
-            <w:tcW w:type="dxa" w:w="1152"/>
+            <w:tcW w:type="dxa" w:w="1296"/>
           </w:tcPr>
           <w:p>
             <w:r>
@@ -3984,19 +3875,19 @@
         </w:tc>
         <w:tc>
           <w:tcPr>
-            <w:tcW w:type="dxa" w:w="1152"/>
-          </w:tcPr>
-          <w:p>
-            <w:r>
-              <w:rPr>
-                <w:sz w:val="18"/>
-              </w:rPr>
-            </w:r>
-          </w:p>
-        </w:tc>
-        <w:tc>
-          <w:tcPr>
-            <w:tcW w:type="dxa" w:w="1152"/>
+            <w:tcW w:type="dxa" w:w="1296"/>
+          </w:tcPr>
+          <w:p>
+            <w:r>
+              <w:rPr>
+                <w:sz w:val="18"/>
+              </w:rPr>
+            </w:r>
+          </w:p>
+        </w:tc>
+        <w:tc>
+          <w:tcPr>
+            <w:tcW w:type="dxa" w:w="1296"/>
           </w:tcPr>
           <w:p>
             <w:r>
@@ -4009,7 +3900,7 @@
         </w:tc>
         <w:tc>
           <w:tcPr>
-            <w:tcW w:type="dxa" w:w="1152"/>
+            <w:tcW w:type="dxa" w:w="1296"/>
           </w:tcPr>
           <w:p>
             <w:r>
@@ -4022,31 +3913,19 @@
         </w:tc>
         <w:tc>
           <w:tcPr>
-            <w:tcW w:type="dxa" w:w="1152"/>
-          </w:tcPr>
-          <w:p>
-            <w:r>
-              <w:rPr>
-                <w:sz w:val="18"/>
-              </w:rPr>
-            </w:r>
-          </w:p>
-        </w:tc>
-        <w:tc>
-          <w:tcPr>
-            <w:tcW w:type="dxa" w:w="1152"/>
-          </w:tcPr>
-          <w:p>
-            <w:r>
-              <w:rPr>
-                <w:sz w:val="18"/>
-              </w:rPr>
-            </w:r>
-          </w:p>
-        </w:tc>
-        <w:tc>
-          <w:tcPr>
-            <w:tcW w:type="dxa" w:w="1152"/>
+            <w:tcW w:type="dxa" w:w="1296"/>
+          </w:tcPr>
+          <w:p>
+            <w:r>
+              <w:rPr>
+                <w:sz w:val="18"/>
+              </w:rPr>
+            </w:r>
+          </w:p>
+        </w:tc>
+        <w:tc>
+          <w:tcPr>
+            <w:tcW w:type="dxa" w:w="1296"/>
           </w:tcPr>
           <w:p>
             <w:r>
@@ -4060,7 +3939,7 @@
       <w:tr>
         <w:tc>
           <w:tcPr>
-            <w:tcW w:type="dxa" w:w="1152"/>
+            <w:tcW w:type="dxa" w:w="1296"/>
           </w:tcPr>
           <w:p>
             <w:r>
@@ -4073,7 +3952,7 @@
         </w:tc>
         <w:tc>
           <w:tcPr>
-            <w:tcW w:type="dxa" w:w="1152"/>
+            <w:tcW w:type="dxa" w:w="1296"/>
           </w:tcPr>
           <w:p>
             <w:r>
@@ -4086,7 +3965,7 @@
         </w:tc>
         <w:tc>
           <w:tcPr>
-            <w:tcW w:type="dxa" w:w="1152"/>
+            <w:tcW w:type="dxa" w:w="1296"/>
           </w:tcPr>
           <w:p>
             <w:r>
@@ -4099,7 +3978,7 @@
         </w:tc>
         <w:tc>
           <w:tcPr>
-            <w:tcW w:type="dxa" w:w="1152"/>
+            <w:tcW w:type="dxa" w:w="1296"/>
           </w:tcPr>
           <w:p>
             <w:r>
@@ -4112,7 +3991,7 @@
         </w:tc>
         <w:tc>
           <w:tcPr>
-            <w:tcW w:type="dxa" w:w="1152"/>
+            <w:tcW w:type="dxa" w:w="1296"/>
           </w:tcPr>
           <w:p>
             <w:r>
@@ -4125,7 +4004,7 @@
         </w:tc>
         <w:tc>
           <w:tcPr>
-            <w:tcW w:type="dxa" w:w="1152"/>
+            <w:tcW w:type="dxa" w:w="1296"/>
           </w:tcPr>
           <w:p>
             <w:r>
@@ -4138,20 +4017,7 @@
         </w:tc>
         <w:tc>
           <w:tcPr>
-            <w:tcW w:type="dxa" w:w="1152"/>
-          </w:tcPr>
-          <w:p>
-            <w:r>
-              <w:rPr>
-                <w:sz w:val="18"/>
-              </w:rPr>
-              <w:t>ক্ষতিগ্রস্ত</w:t>
-            </w:r>
-          </w:p>
-        </w:tc>
-        <w:tc>
-          <w:tcPr>
-            <w:tcW w:type="dxa" w:w="1152"/>
+            <w:tcW w:type="dxa" w:w="1296"/>
           </w:tcPr>
           <w:p>
             <w:r>
@@ -4164,7 +4030,7 @@
         </w:tc>
         <w:tc>
           <w:tcPr>
-            <w:tcW w:type="dxa" w:w="1152"/>
+            <w:tcW w:type="dxa" w:w="1296"/>
           </w:tcPr>
           <w:p>
             <w:r>
@@ -4179,7 +4045,7 @@
       <w:tr>
         <w:tc>
           <w:tcPr>
-            <w:tcW w:type="dxa" w:w="1152"/>
+            <w:tcW w:type="dxa" w:w="1296"/>
           </w:tcPr>
           <w:p>
             <w:r>
@@ -4192,7 +4058,7 @@
         </w:tc>
         <w:tc>
           <w:tcPr>
-            <w:tcW w:type="dxa" w:w="1152"/>
+            <w:tcW w:type="dxa" w:w="1296"/>
           </w:tcPr>
           <w:p>
             <w:r>
@@ -4205,7 +4071,7 @@
         </w:tc>
         <w:tc>
           <w:tcPr>
-            <w:tcW w:type="dxa" w:w="1152"/>
+            <w:tcW w:type="dxa" w:w="1296"/>
           </w:tcPr>
           <w:p>
             <w:r>
@@ -4218,19 +4084,19 @@
         </w:tc>
         <w:tc>
           <w:tcPr>
-            <w:tcW w:type="dxa" w:w="1152"/>
-          </w:tcPr>
-          <w:p>
-            <w:r>
-              <w:rPr>
-                <w:sz w:val="18"/>
-              </w:rPr>
-            </w:r>
-          </w:p>
-        </w:tc>
-        <w:tc>
-          <w:tcPr>
-            <w:tcW w:type="dxa" w:w="1152"/>
+            <w:tcW w:type="dxa" w:w="1296"/>
+          </w:tcPr>
+          <w:p>
+            <w:r>
+              <w:rPr>
+                <w:sz w:val="18"/>
+              </w:rPr>
+            </w:r>
+          </w:p>
+        </w:tc>
+        <w:tc>
+          <w:tcPr>
+            <w:tcW w:type="dxa" w:w="1296"/>
           </w:tcPr>
           <w:p>
             <w:r>
@@ -4243,7 +4109,7 @@
         </w:tc>
         <w:tc>
           <w:tcPr>
-            <w:tcW w:type="dxa" w:w="1152"/>
+            <w:tcW w:type="dxa" w:w="1296"/>
           </w:tcPr>
           <w:p>
             <w:r>
@@ -4256,31 +4122,19 @@
         </w:tc>
         <w:tc>
           <w:tcPr>
-            <w:tcW w:type="dxa" w:w="1152"/>
-          </w:tcPr>
-          <w:p>
-            <w:r>
-              <w:rPr>
-                <w:sz w:val="18"/>
-              </w:rPr>
-            </w:r>
-          </w:p>
-        </w:tc>
-        <w:tc>
-          <w:tcPr>
-            <w:tcW w:type="dxa" w:w="1152"/>
-          </w:tcPr>
-          <w:p>
-            <w:r>
-              <w:rPr>
-                <w:sz w:val="18"/>
-              </w:rPr>
-            </w:r>
-          </w:p>
-        </w:tc>
-        <w:tc>
-          <w:tcPr>
-            <w:tcW w:type="dxa" w:w="1152"/>
+            <w:tcW w:type="dxa" w:w="1296"/>
+          </w:tcPr>
+          <w:p>
+            <w:r>
+              <w:rPr>
+                <w:sz w:val="18"/>
+              </w:rPr>
+            </w:r>
+          </w:p>
+        </w:tc>
+        <w:tc>
+          <w:tcPr>
+            <w:tcW w:type="dxa" w:w="1296"/>
           </w:tcPr>
           <w:p>
             <w:r>
@@ -4294,7 +4148,7 @@
       <w:tr>
         <w:tc>
           <w:tcPr>
-            <w:tcW w:type="dxa" w:w="1152"/>
+            <w:tcW w:type="dxa" w:w="1296"/>
           </w:tcPr>
           <w:p>
             <w:r>
@@ -4307,7 +4161,7 @@
         </w:tc>
         <w:tc>
           <w:tcPr>
-            <w:tcW w:type="dxa" w:w="1152"/>
+            <w:tcW w:type="dxa" w:w="1296"/>
           </w:tcPr>
           <w:p>
             <w:r>
@@ -4320,7 +4174,7 @@
         </w:tc>
         <w:tc>
           <w:tcPr>
-            <w:tcW w:type="dxa" w:w="1152"/>
+            <w:tcW w:type="dxa" w:w="1296"/>
           </w:tcPr>
           <w:p>
             <w:r>
@@ -4333,19 +4187,19 @@
         </w:tc>
         <w:tc>
           <w:tcPr>
-            <w:tcW w:type="dxa" w:w="1152"/>
-          </w:tcPr>
-          <w:p>
-            <w:r>
-              <w:rPr>
-                <w:sz w:val="18"/>
-              </w:rPr>
-            </w:r>
-          </w:p>
-        </w:tc>
-        <w:tc>
-          <w:tcPr>
-            <w:tcW w:type="dxa" w:w="1152"/>
+            <w:tcW w:type="dxa" w:w="1296"/>
+          </w:tcPr>
+          <w:p>
+            <w:r>
+              <w:rPr>
+                <w:sz w:val="18"/>
+              </w:rPr>
+            </w:r>
+          </w:p>
+        </w:tc>
+        <w:tc>
+          <w:tcPr>
+            <w:tcW w:type="dxa" w:w="1296"/>
           </w:tcPr>
           <w:p>
             <w:r>
@@ -4358,7 +4212,7 @@
         </w:tc>
         <w:tc>
           <w:tcPr>
-            <w:tcW w:type="dxa" w:w="1152"/>
+            <w:tcW w:type="dxa" w:w="1296"/>
           </w:tcPr>
           <w:p>
             <w:r>
@@ -4371,31 +4225,19 @@
         </w:tc>
         <w:tc>
           <w:tcPr>
-            <w:tcW w:type="dxa" w:w="1152"/>
-          </w:tcPr>
-          <w:p>
-            <w:r>
-              <w:rPr>
-                <w:sz w:val="18"/>
-              </w:rPr>
-            </w:r>
-          </w:p>
-        </w:tc>
-        <w:tc>
-          <w:tcPr>
-            <w:tcW w:type="dxa" w:w="1152"/>
-          </w:tcPr>
-          <w:p>
-            <w:r>
-              <w:rPr>
-                <w:sz w:val="18"/>
-              </w:rPr>
-            </w:r>
-          </w:p>
-        </w:tc>
-        <w:tc>
-          <w:tcPr>
-            <w:tcW w:type="dxa" w:w="1152"/>
+            <w:tcW w:type="dxa" w:w="1296"/>
+          </w:tcPr>
+          <w:p>
+            <w:r>
+              <w:rPr>
+                <w:sz w:val="18"/>
+              </w:rPr>
+            </w:r>
+          </w:p>
+        </w:tc>
+        <w:tc>
+          <w:tcPr>
+            <w:tcW w:type="dxa" w:w="1296"/>
           </w:tcPr>
           <w:p>
             <w:r>
@@ -4409,7 +4251,7 @@
       <w:tr>
         <w:tc>
           <w:tcPr>
-            <w:tcW w:type="dxa" w:w="1152"/>
+            <w:tcW w:type="dxa" w:w="1296"/>
           </w:tcPr>
           <w:p>
             <w:r>
@@ -4422,7 +4264,7 @@
         </w:tc>
         <w:tc>
           <w:tcPr>
-            <w:tcW w:type="dxa" w:w="1152"/>
+            <w:tcW w:type="dxa" w:w="1296"/>
           </w:tcPr>
           <w:p>
             <w:r>
@@ -4435,7 +4277,7 @@
         </w:tc>
         <w:tc>
           <w:tcPr>
-            <w:tcW w:type="dxa" w:w="1152"/>
+            <w:tcW w:type="dxa" w:w="1296"/>
           </w:tcPr>
           <w:p>
             <w:r>
@@ -4448,19 +4290,19 @@
         </w:tc>
         <w:tc>
           <w:tcPr>
-            <w:tcW w:type="dxa" w:w="1152"/>
-          </w:tcPr>
-          <w:p>
-            <w:r>
-              <w:rPr>
-                <w:sz w:val="18"/>
-              </w:rPr>
-            </w:r>
-          </w:p>
-        </w:tc>
-        <w:tc>
-          <w:tcPr>
-            <w:tcW w:type="dxa" w:w="1152"/>
+            <w:tcW w:type="dxa" w:w="1296"/>
+          </w:tcPr>
+          <w:p>
+            <w:r>
+              <w:rPr>
+                <w:sz w:val="18"/>
+              </w:rPr>
+            </w:r>
+          </w:p>
+        </w:tc>
+        <w:tc>
+          <w:tcPr>
+            <w:tcW w:type="dxa" w:w="1296"/>
           </w:tcPr>
           <w:p>
             <w:r>
@@ -4473,7 +4315,7 @@
         </w:tc>
         <w:tc>
           <w:tcPr>
-            <w:tcW w:type="dxa" w:w="1152"/>
+            <w:tcW w:type="dxa" w:w="1296"/>
           </w:tcPr>
           <w:p>
             <w:r>
@@ -4486,31 +4328,19 @@
         </w:tc>
         <w:tc>
           <w:tcPr>
-            <w:tcW w:type="dxa" w:w="1152"/>
-          </w:tcPr>
-          <w:p>
-            <w:r>
-              <w:rPr>
-                <w:sz w:val="18"/>
-              </w:rPr>
-            </w:r>
-          </w:p>
-        </w:tc>
-        <w:tc>
-          <w:tcPr>
-            <w:tcW w:type="dxa" w:w="1152"/>
-          </w:tcPr>
-          <w:p>
-            <w:r>
-              <w:rPr>
-                <w:sz w:val="18"/>
-              </w:rPr>
-            </w:r>
-          </w:p>
-        </w:tc>
-        <w:tc>
-          <w:tcPr>
-            <w:tcW w:type="dxa" w:w="1152"/>
+            <w:tcW w:type="dxa" w:w="1296"/>
+          </w:tcPr>
+          <w:p>
+            <w:r>
+              <w:rPr>
+                <w:sz w:val="18"/>
+              </w:rPr>
+            </w:r>
+          </w:p>
+        </w:tc>
+        <w:tc>
+          <w:tcPr>
+            <w:tcW w:type="dxa" w:w="1296"/>
           </w:tcPr>
           <w:p>
             <w:r>
@@ -4524,7 +4354,7 @@
       <w:tr>
         <w:tc>
           <w:tcPr>
-            <w:tcW w:type="dxa" w:w="1152"/>
+            <w:tcW w:type="dxa" w:w="1296"/>
           </w:tcPr>
           <w:p>
             <w:r>
@@ -4537,7 +4367,7 @@
         </w:tc>
         <w:tc>
           <w:tcPr>
-            <w:tcW w:type="dxa" w:w="1152"/>
+            <w:tcW w:type="dxa" w:w="1296"/>
           </w:tcPr>
           <w:p>
             <w:r>
@@ -4550,7 +4380,7 @@
         </w:tc>
         <w:tc>
           <w:tcPr>
-            <w:tcW w:type="dxa" w:w="1152"/>
+            <w:tcW w:type="dxa" w:w="1296"/>
           </w:tcPr>
           <w:p>
             <w:r>
@@ -4563,19 +4393,19 @@
         </w:tc>
         <w:tc>
           <w:tcPr>
-            <w:tcW w:type="dxa" w:w="1152"/>
-          </w:tcPr>
-          <w:p>
-            <w:r>
-              <w:rPr>
-                <w:sz w:val="18"/>
-              </w:rPr>
-            </w:r>
-          </w:p>
-        </w:tc>
-        <w:tc>
-          <w:tcPr>
-            <w:tcW w:type="dxa" w:w="1152"/>
+            <w:tcW w:type="dxa" w:w="1296"/>
+          </w:tcPr>
+          <w:p>
+            <w:r>
+              <w:rPr>
+                <w:sz w:val="18"/>
+              </w:rPr>
+            </w:r>
+          </w:p>
+        </w:tc>
+        <w:tc>
+          <w:tcPr>
+            <w:tcW w:type="dxa" w:w="1296"/>
           </w:tcPr>
           <w:p>
             <w:r>
@@ -4588,7 +4418,7 @@
         </w:tc>
         <w:tc>
           <w:tcPr>
-            <w:tcW w:type="dxa" w:w="1152"/>
+            <w:tcW w:type="dxa" w:w="1296"/>
           </w:tcPr>
           <w:p>
             <w:r>
@@ -4601,31 +4431,19 @@
         </w:tc>
         <w:tc>
           <w:tcPr>
-            <w:tcW w:type="dxa" w:w="1152"/>
-          </w:tcPr>
-          <w:p>
-            <w:r>
-              <w:rPr>
-                <w:sz w:val="18"/>
-              </w:rPr>
-            </w:r>
-          </w:p>
-        </w:tc>
-        <w:tc>
-          <w:tcPr>
-            <w:tcW w:type="dxa" w:w="1152"/>
-          </w:tcPr>
-          <w:p>
-            <w:r>
-              <w:rPr>
-                <w:sz w:val="18"/>
-              </w:rPr>
-            </w:r>
-          </w:p>
-        </w:tc>
-        <w:tc>
-          <w:tcPr>
-            <w:tcW w:type="dxa" w:w="1152"/>
+            <w:tcW w:type="dxa" w:w="1296"/>
+          </w:tcPr>
+          <w:p>
+            <w:r>
+              <w:rPr>
+                <w:sz w:val="18"/>
+              </w:rPr>
+            </w:r>
+          </w:p>
+        </w:tc>
+        <w:tc>
+          <w:tcPr>
+            <w:tcW w:type="dxa" w:w="1296"/>
           </w:tcPr>
           <w:p>
             <w:r>
@@ -4639,7 +4457,7 @@
       <w:tr>
         <w:tc>
           <w:tcPr>
-            <w:tcW w:type="dxa" w:w="1152"/>
+            <w:tcW w:type="dxa" w:w="1296"/>
           </w:tcPr>
           <w:p>
             <w:r>
@@ -4652,7 +4470,7 @@
         </w:tc>
         <w:tc>
           <w:tcPr>
-            <w:tcW w:type="dxa" w:w="1152"/>
+            <w:tcW w:type="dxa" w:w="1296"/>
           </w:tcPr>
           <w:p>
             <w:r>
@@ -4665,7 +4483,7 @@
         </w:tc>
         <w:tc>
           <w:tcPr>
-            <w:tcW w:type="dxa" w:w="1152"/>
+            <w:tcW w:type="dxa" w:w="1296"/>
           </w:tcPr>
           <w:p>
             <w:r>
@@ -4678,19 +4496,19 @@
         </w:tc>
         <w:tc>
           <w:tcPr>
-            <w:tcW w:type="dxa" w:w="1152"/>
-          </w:tcPr>
-          <w:p>
-            <w:r>
-              <w:rPr>
-                <w:sz w:val="18"/>
-              </w:rPr>
-            </w:r>
-          </w:p>
-        </w:tc>
-        <w:tc>
-          <w:tcPr>
-            <w:tcW w:type="dxa" w:w="1152"/>
+            <w:tcW w:type="dxa" w:w="1296"/>
+          </w:tcPr>
+          <w:p>
+            <w:r>
+              <w:rPr>
+                <w:sz w:val="18"/>
+              </w:rPr>
+            </w:r>
+          </w:p>
+        </w:tc>
+        <w:tc>
+          <w:tcPr>
+            <w:tcW w:type="dxa" w:w="1296"/>
           </w:tcPr>
           <w:p>
             <w:r>
@@ -4703,7 +4521,7 @@
         </w:tc>
         <w:tc>
           <w:tcPr>
-            <w:tcW w:type="dxa" w:w="1152"/>
+            <w:tcW w:type="dxa" w:w="1296"/>
           </w:tcPr>
           <w:p>
             <w:r>
@@ -4716,31 +4534,19 @@
         </w:tc>
         <w:tc>
           <w:tcPr>
-            <w:tcW w:type="dxa" w:w="1152"/>
-          </w:tcPr>
-          <w:p>
-            <w:r>
-              <w:rPr>
-                <w:sz w:val="18"/>
-              </w:rPr>
-            </w:r>
-          </w:p>
-        </w:tc>
-        <w:tc>
-          <w:tcPr>
-            <w:tcW w:type="dxa" w:w="1152"/>
-          </w:tcPr>
-          <w:p>
-            <w:r>
-              <w:rPr>
-                <w:sz w:val="18"/>
-              </w:rPr>
-            </w:r>
-          </w:p>
-        </w:tc>
-        <w:tc>
-          <w:tcPr>
-            <w:tcW w:type="dxa" w:w="1152"/>
+            <w:tcW w:type="dxa" w:w="1296"/>
+          </w:tcPr>
+          <w:p>
+            <w:r>
+              <w:rPr>
+                <w:sz w:val="18"/>
+              </w:rPr>
+            </w:r>
+          </w:p>
+        </w:tc>
+        <w:tc>
+          <w:tcPr>
+            <w:tcW w:type="dxa" w:w="1296"/>
           </w:tcPr>
           <w:p>
             <w:r>
@@ -4754,7 +4560,7 @@
       <w:tr>
         <w:tc>
           <w:tcPr>
-            <w:tcW w:type="dxa" w:w="1152"/>
+            <w:tcW w:type="dxa" w:w="1296"/>
           </w:tcPr>
           <w:p>
             <w:r>
@@ -4767,7 +4573,7 @@
         </w:tc>
         <w:tc>
           <w:tcPr>
-            <w:tcW w:type="dxa" w:w="1152"/>
+            <w:tcW w:type="dxa" w:w="1296"/>
           </w:tcPr>
           <w:p>
             <w:r>
@@ -4780,7 +4586,7 @@
         </w:tc>
         <w:tc>
           <w:tcPr>
-            <w:tcW w:type="dxa" w:w="1152"/>
+            <w:tcW w:type="dxa" w:w="1296"/>
           </w:tcPr>
           <w:p>
             <w:r>
@@ -4793,19 +4599,19 @@
         </w:tc>
         <w:tc>
           <w:tcPr>
-            <w:tcW w:type="dxa" w:w="1152"/>
-          </w:tcPr>
-          <w:p>
-            <w:r>
-              <w:rPr>
-                <w:sz w:val="18"/>
-              </w:rPr>
-            </w:r>
-          </w:p>
-        </w:tc>
-        <w:tc>
-          <w:tcPr>
-            <w:tcW w:type="dxa" w:w="1152"/>
+            <w:tcW w:type="dxa" w:w="1296"/>
+          </w:tcPr>
+          <w:p>
+            <w:r>
+              <w:rPr>
+                <w:sz w:val="18"/>
+              </w:rPr>
+            </w:r>
+          </w:p>
+        </w:tc>
+        <w:tc>
+          <w:tcPr>
+            <w:tcW w:type="dxa" w:w="1296"/>
           </w:tcPr>
           <w:p>
             <w:r>
@@ -4818,7 +4624,7 @@
         </w:tc>
         <w:tc>
           <w:tcPr>
-            <w:tcW w:type="dxa" w:w="1152"/>
+            <w:tcW w:type="dxa" w:w="1296"/>
           </w:tcPr>
           <w:p>
             <w:r>
@@ -4831,31 +4637,19 @@
         </w:tc>
         <w:tc>
           <w:tcPr>
-            <w:tcW w:type="dxa" w:w="1152"/>
-          </w:tcPr>
-          <w:p>
-            <w:r>
-              <w:rPr>
-                <w:sz w:val="18"/>
-              </w:rPr>
-            </w:r>
-          </w:p>
-        </w:tc>
-        <w:tc>
-          <w:tcPr>
-            <w:tcW w:type="dxa" w:w="1152"/>
-          </w:tcPr>
-          <w:p>
-            <w:r>
-              <w:rPr>
-                <w:sz w:val="18"/>
-              </w:rPr>
-            </w:r>
-          </w:p>
-        </w:tc>
-        <w:tc>
-          <w:tcPr>
-            <w:tcW w:type="dxa" w:w="1152"/>
+            <w:tcW w:type="dxa" w:w="1296"/>
+          </w:tcPr>
+          <w:p>
+            <w:r>
+              <w:rPr>
+                <w:sz w:val="18"/>
+              </w:rPr>
+            </w:r>
+          </w:p>
+        </w:tc>
+        <w:tc>
+          <w:tcPr>
+            <w:tcW w:type="dxa" w:w="1296"/>
           </w:tcPr>
           <w:p>
             <w:r>
@@ -4869,7 +4663,7 @@
       <w:tr>
         <w:tc>
           <w:tcPr>
-            <w:tcW w:type="dxa" w:w="1152"/>
+            <w:tcW w:type="dxa" w:w="1296"/>
           </w:tcPr>
           <w:p>
             <w:r>
@@ -4882,7 +4676,7 @@
         </w:tc>
         <w:tc>
           <w:tcPr>
-            <w:tcW w:type="dxa" w:w="1152"/>
+            <w:tcW w:type="dxa" w:w="1296"/>
           </w:tcPr>
           <w:p>
             <w:r>
@@ -4895,7 +4689,7 @@
         </w:tc>
         <w:tc>
           <w:tcPr>
-            <w:tcW w:type="dxa" w:w="1152"/>
+            <w:tcW w:type="dxa" w:w="1296"/>
           </w:tcPr>
           <w:p>
             <w:r>
@@ -4908,19 +4702,19 @@
         </w:tc>
         <w:tc>
           <w:tcPr>
-            <w:tcW w:type="dxa" w:w="1152"/>
-          </w:tcPr>
-          <w:p>
-            <w:r>
-              <w:rPr>
-                <w:sz w:val="18"/>
-              </w:rPr>
-            </w:r>
-          </w:p>
-        </w:tc>
-        <w:tc>
-          <w:tcPr>
-            <w:tcW w:type="dxa" w:w="1152"/>
+            <w:tcW w:type="dxa" w:w="1296"/>
+          </w:tcPr>
+          <w:p>
+            <w:r>
+              <w:rPr>
+                <w:sz w:val="18"/>
+              </w:rPr>
+            </w:r>
+          </w:p>
+        </w:tc>
+        <w:tc>
+          <w:tcPr>
+            <w:tcW w:type="dxa" w:w="1296"/>
           </w:tcPr>
           <w:p>
             <w:r>
@@ -4933,7 +4727,7 @@
         </w:tc>
         <w:tc>
           <w:tcPr>
-            <w:tcW w:type="dxa" w:w="1152"/>
+            <w:tcW w:type="dxa" w:w="1296"/>
           </w:tcPr>
           <w:p>
             <w:r>
@@ -4946,31 +4740,19 @@
         </w:tc>
         <w:tc>
           <w:tcPr>
-            <w:tcW w:type="dxa" w:w="1152"/>
-          </w:tcPr>
-          <w:p>
-            <w:r>
-              <w:rPr>
-                <w:sz w:val="18"/>
-              </w:rPr>
-            </w:r>
-          </w:p>
-        </w:tc>
-        <w:tc>
-          <w:tcPr>
-            <w:tcW w:type="dxa" w:w="1152"/>
-          </w:tcPr>
-          <w:p>
-            <w:r>
-              <w:rPr>
-                <w:sz w:val="18"/>
-              </w:rPr>
-            </w:r>
-          </w:p>
-        </w:tc>
-        <w:tc>
-          <w:tcPr>
-            <w:tcW w:type="dxa" w:w="1152"/>
+            <w:tcW w:type="dxa" w:w="1296"/>
+          </w:tcPr>
+          <w:p>
+            <w:r>
+              <w:rPr>
+                <w:sz w:val="18"/>
+              </w:rPr>
+            </w:r>
+          </w:p>
+        </w:tc>
+        <w:tc>
+          <w:tcPr>
+            <w:tcW w:type="dxa" w:w="1296"/>
           </w:tcPr>
           <w:p>
             <w:r>
@@ -4984,7 +4766,7 @@
       <w:tr>
         <w:tc>
           <w:tcPr>
-            <w:tcW w:type="dxa" w:w="1152"/>
+            <w:tcW w:type="dxa" w:w="1296"/>
           </w:tcPr>
           <w:p>
             <w:r>
@@ -4997,7 +4779,7 @@
         </w:tc>
         <w:tc>
           <w:tcPr>
-            <w:tcW w:type="dxa" w:w="1152"/>
+            <w:tcW w:type="dxa" w:w="1296"/>
           </w:tcPr>
           <w:p>
             <w:r>
@@ -5010,7 +4792,7 @@
         </w:tc>
         <w:tc>
           <w:tcPr>
-            <w:tcW w:type="dxa" w:w="1152"/>
+            <w:tcW w:type="dxa" w:w="1296"/>
           </w:tcPr>
           <w:p>
             <w:r>
@@ -5023,19 +4805,19 @@
         </w:tc>
         <w:tc>
           <w:tcPr>
-            <w:tcW w:type="dxa" w:w="1152"/>
-          </w:tcPr>
-          <w:p>
-            <w:r>
-              <w:rPr>
-                <w:sz w:val="18"/>
-              </w:rPr>
-            </w:r>
-          </w:p>
-        </w:tc>
-        <w:tc>
-          <w:tcPr>
-            <w:tcW w:type="dxa" w:w="1152"/>
+            <w:tcW w:type="dxa" w:w="1296"/>
+          </w:tcPr>
+          <w:p>
+            <w:r>
+              <w:rPr>
+                <w:sz w:val="18"/>
+              </w:rPr>
+            </w:r>
+          </w:p>
+        </w:tc>
+        <w:tc>
+          <w:tcPr>
+            <w:tcW w:type="dxa" w:w="1296"/>
           </w:tcPr>
           <w:p>
             <w:r>
@@ -5048,7 +4830,7 @@
         </w:tc>
         <w:tc>
           <w:tcPr>
-            <w:tcW w:type="dxa" w:w="1152"/>
+            <w:tcW w:type="dxa" w:w="1296"/>
           </w:tcPr>
           <w:p>
             <w:r>
@@ -5061,31 +4843,19 @@
         </w:tc>
         <w:tc>
           <w:tcPr>
-            <w:tcW w:type="dxa" w:w="1152"/>
-          </w:tcPr>
-          <w:p>
-            <w:r>
-              <w:rPr>
-                <w:sz w:val="18"/>
-              </w:rPr>
-            </w:r>
-          </w:p>
-        </w:tc>
-        <w:tc>
-          <w:tcPr>
-            <w:tcW w:type="dxa" w:w="1152"/>
-          </w:tcPr>
-          <w:p>
-            <w:r>
-              <w:rPr>
-                <w:sz w:val="18"/>
-              </w:rPr>
-            </w:r>
-          </w:p>
-        </w:tc>
-        <w:tc>
-          <w:tcPr>
-            <w:tcW w:type="dxa" w:w="1152"/>
+            <w:tcW w:type="dxa" w:w="1296"/>
+          </w:tcPr>
+          <w:p>
+            <w:r>
+              <w:rPr>
+                <w:sz w:val="18"/>
+              </w:rPr>
+            </w:r>
+          </w:p>
+        </w:tc>
+        <w:tc>
+          <w:tcPr>
+            <w:tcW w:type="dxa" w:w="1296"/>
           </w:tcPr>
           <w:p>
             <w:r>
@@ -5099,7 +4869,7 @@
       <w:tr>
         <w:tc>
           <w:tcPr>
-            <w:tcW w:type="dxa" w:w="1152"/>
+            <w:tcW w:type="dxa" w:w="1296"/>
           </w:tcPr>
           <w:p>
             <w:r>
@@ -5112,7 +4882,7 @@
         </w:tc>
         <w:tc>
           <w:tcPr>
-            <w:tcW w:type="dxa" w:w="1152"/>
+            <w:tcW w:type="dxa" w:w="1296"/>
           </w:tcPr>
           <w:p>
             <w:r>
@@ -5125,7 +4895,7 @@
         </w:tc>
         <w:tc>
           <w:tcPr>
-            <w:tcW w:type="dxa" w:w="1152"/>
+            <w:tcW w:type="dxa" w:w="1296"/>
           </w:tcPr>
           <w:p>
             <w:r>
@@ -5138,19 +4908,19 @@
         </w:tc>
         <w:tc>
           <w:tcPr>
-            <w:tcW w:type="dxa" w:w="1152"/>
-          </w:tcPr>
-          <w:p>
-            <w:r>
-              <w:rPr>
-                <w:sz w:val="18"/>
-              </w:rPr>
-            </w:r>
-          </w:p>
-        </w:tc>
-        <w:tc>
-          <w:tcPr>
-            <w:tcW w:type="dxa" w:w="1152"/>
+            <w:tcW w:type="dxa" w:w="1296"/>
+          </w:tcPr>
+          <w:p>
+            <w:r>
+              <w:rPr>
+                <w:sz w:val="18"/>
+              </w:rPr>
+            </w:r>
+          </w:p>
+        </w:tc>
+        <w:tc>
+          <w:tcPr>
+            <w:tcW w:type="dxa" w:w="1296"/>
           </w:tcPr>
           <w:p>
             <w:r>
@@ -5163,7 +4933,7 @@
         </w:tc>
         <w:tc>
           <w:tcPr>
-            <w:tcW w:type="dxa" w:w="1152"/>
+            <w:tcW w:type="dxa" w:w="1296"/>
           </w:tcPr>
           <w:p>
             <w:r>
@@ -5176,31 +4946,19 @@
         </w:tc>
         <w:tc>
           <w:tcPr>
-            <w:tcW w:type="dxa" w:w="1152"/>
-          </w:tcPr>
-          <w:p>
-            <w:r>
-              <w:rPr>
-                <w:sz w:val="18"/>
-              </w:rPr>
-            </w:r>
-          </w:p>
-        </w:tc>
-        <w:tc>
-          <w:tcPr>
-            <w:tcW w:type="dxa" w:w="1152"/>
-          </w:tcPr>
-          <w:p>
-            <w:r>
-              <w:rPr>
-                <w:sz w:val="18"/>
-              </w:rPr>
-            </w:r>
-          </w:p>
-        </w:tc>
-        <w:tc>
-          <w:tcPr>
-            <w:tcW w:type="dxa" w:w="1152"/>
+            <w:tcW w:type="dxa" w:w="1296"/>
+          </w:tcPr>
+          <w:p>
+            <w:r>
+              <w:rPr>
+                <w:sz w:val="18"/>
+              </w:rPr>
+            </w:r>
+          </w:p>
+        </w:tc>
+        <w:tc>
+          <w:tcPr>
+            <w:tcW w:type="dxa" w:w="1296"/>
           </w:tcPr>
           <w:p>
             <w:r>
@@ -5214,7 +4972,7 @@
       <w:tr>
         <w:tc>
           <w:tcPr>
-            <w:tcW w:type="dxa" w:w="1152"/>
+            <w:tcW w:type="dxa" w:w="1296"/>
           </w:tcPr>
           <w:p>
             <w:r>
@@ -5227,7 +4985,7 @@
         </w:tc>
         <w:tc>
           <w:tcPr>
-            <w:tcW w:type="dxa" w:w="1152"/>
+            <w:tcW w:type="dxa" w:w="1296"/>
           </w:tcPr>
           <w:p>
             <w:r>
@@ -5240,7 +4998,7 @@
         </w:tc>
         <w:tc>
           <w:tcPr>
-            <w:tcW w:type="dxa" w:w="1152"/>
+            <w:tcW w:type="dxa" w:w="1296"/>
           </w:tcPr>
           <w:p>
             <w:r>
@@ -5253,19 +5011,19 @@
         </w:tc>
         <w:tc>
           <w:tcPr>
-            <w:tcW w:type="dxa" w:w="1152"/>
-          </w:tcPr>
-          <w:p>
-            <w:r>
-              <w:rPr>
-                <w:sz w:val="18"/>
-              </w:rPr>
-            </w:r>
-          </w:p>
-        </w:tc>
-        <w:tc>
-          <w:tcPr>
-            <w:tcW w:type="dxa" w:w="1152"/>
+            <w:tcW w:type="dxa" w:w="1296"/>
+          </w:tcPr>
+          <w:p>
+            <w:r>
+              <w:rPr>
+                <w:sz w:val="18"/>
+              </w:rPr>
+            </w:r>
+          </w:p>
+        </w:tc>
+        <w:tc>
+          <w:tcPr>
+            <w:tcW w:type="dxa" w:w="1296"/>
           </w:tcPr>
           <w:p>
             <w:r>
@@ -5278,7 +5036,7 @@
         </w:tc>
         <w:tc>
           <w:tcPr>
-            <w:tcW w:type="dxa" w:w="1152"/>
+            <w:tcW w:type="dxa" w:w="1296"/>
           </w:tcPr>
           <w:p>
             <w:r>
@@ -5291,31 +5049,19 @@
         </w:tc>
         <w:tc>
           <w:tcPr>
-            <w:tcW w:type="dxa" w:w="1152"/>
-          </w:tcPr>
-          <w:p>
-            <w:r>
-              <w:rPr>
-                <w:sz w:val="18"/>
-              </w:rPr>
-            </w:r>
-          </w:p>
-        </w:tc>
-        <w:tc>
-          <w:tcPr>
-            <w:tcW w:type="dxa" w:w="1152"/>
-          </w:tcPr>
-          <w:p>
-            <w:r>
-              <w:rPr>
-                <w:sz w:val="18"/>
-              </w:rPr>
-            </w:r>
-          </w:p>
-        </w:tc>
-        <w:tc>
-          <w:tcPr>
-            <w:tcW w:type="dxa" w:w="1152"/>
+            <w:tcW w:type="dxa" w:w="1296"/>
+          </w:tcPr>
+          <w:p>
+            <w:r>
+              <w:rPr>
+                <w:sz w:val="18"/>
+              </w:rPr>
+            </w:r>
+          </w:p>
+        </w:tc>
+        <w:tc>
+          <w:tcPr>
+            <w:tcW w:type="dxa" w:w="1296"/>
           </w:tcPr>
           <w:p>
             <w:r>

</xml_diff>

<commit_message>
Add photo folder links CSV and update data collection scripts
- Introduced a new CSV file for photo folder links, facilitating easier access to image resources.
- Enhanced the Jupyter notebook to print full folder links for easier copying to the CSV.
- Updated the data collection script to load photo links from the new CSV, improving data integration and organization.
</commit_message>
<xml_diff>
--- a/docs/BRRI_Win2024_Data_Collection_Form.docx
+++ b/docs/BRRI_Win2024_Data_Collection_Form.docx
@@ -3096,6 +3096,7 @@
               <w:rPr>
                 <w:sz w:val="18"/>
               </w:rPr>
+              <w:t>https://drive.google.com/drive/folders/1VLPm4InCDlgbWkAl86Z9Ioiqcu0Pg4g-</w:t>
             </w:r>
           </w:p>
         </w:tc>
@@ -3199,6 +3200,7 @@
               <w:rPr>
                 <w:sz w:val="18"/>
               </w:rPr>
+              <w:t>https://drive.google.com/drive/folders/1AHDugpT6SgzSkal4CcQ7w_pSUdG6F8IV</w:t>
             </w:r>
           </w:p>
         </w:tc>
@@ -3302,6 +3304,7 @@
               <w:rPr>
                 <w:sz w:val="18"/>
               </w:rPr>
+              <w:t>https://drive.google.com/drive/folders/1Kw3kykMbfvog_-Jq43XpDNCKsPrI3aje</w:t>
             </w:r>
           </w:p>
         </w:tc>
@@ -3405,6 +3408,7 @@
               <w:rPr>
                 <w:sz w:val="18"/>
               </w:rPr>
+              <w:t>https://drive.google.com/drive/folders/1_EAPHwNpd5Mh5h82fbRK8-v3Kun-_KV7</w:t>
             </w:r>
           </w:p>
         </w:tc>
@@ -3508,6 +3512,7 @@
               <w:rPr>
                 <w:sz w:val="18"/>
               </w:rPr>
+              <w:t>https://drive.google.com/drive/folders/172FW2hwcXTPpcFuRFemMLeLmrQDuv0LA</w:t>
             </w:r>
           </w:p>
         </w:tc>
@@ -3611,6 +3616,7 @@
               <w:rPr>
                 <w:sz w:val="18"/>
               </w:rPr>
+              <w:t>https://drive.google.com/drive/folders/1jm9fXmaNC5bFKQilUDwo4Meuq0pMq_v8</w:t>
             </w:r>
           </w:p>
         </w:tc>
@@ -3714,6 +3720,7 @@
               <w:rPr>
                 <w:sz w:val="18"/>
               </w:rPr>
+              <w:t>https://drive.google.com/drive/folders/1ik1B7IBv2xAOlPP_FfNfz94SYdx1v-Jl</w:t>
             </w:r>
           </w:p>
         </w:tc>
@@ -3817,6 +3824,7 @@
               <w:rPr>
                 <w:sz w:val="18"/>
               </w:rPr>
+              <w:t>https://drive.google.com/drive/folders/1Ro37kxxYCbQin-dZYcTAdhKZ1Bbzy5SW</w:t>
             </w:r>
           </w:p>
         </w:tc>
@@ -3920,6 +3928,7 @@
               <w:rPr>
                 <w:sz w:val="18"/>
               </w:rPr>
+              <w:t>https://drive.google.com/drive/folders/198T94YJUEDyKdL-Td194qSTqHF6Xyk3M</w:t>
             </w:r>
           </w:p>
         </w:tc>
@@ -4024,7 +4033,7 @@
               <w:rPr>
                 <w:sz w:val="18"/>
               </w:rPr>
-              <w:t>https://drive.google.com/drive/folders/1BRRI_Win2024_Patuakhali_Demo/10_POWER_PULLEY_BELT/10_b65_marking.jpg</w:t>
+              <w:t>https://drive.google.com/drive/folders/1K4max0OqE-NcZm-hkp-aNrh6XEzrTUL5</w:t>
             </w:r>
           </w:p>
         </w:tc>
@@ -4129,6 +4138,7 @@
               <w:rPr>
                 <w:sz w:val="18"/>
               </w:rPr>
+              <w:t>https://drive.google.com/drive/folders/1RlalWgKPfoBImEu1y0ajPnf9ipueeJnS</w:t>
             </w:r>
           </w:p>
         </w:tc>
@@ -4232,6 +4242,7 @@
               <w:rPr>
                 <w:sz w:val="18"/>
               </w:rPr>
+              <w:t>https://drive.google.com/drive/folders/1iHfqXbiC-r3SxHPDtZFZ_aUz3VQTmRwA</w:t>
             </w:r>
           </w:p>
         </w:tc>
@@ -4335,6 +4346,7 @@
               <w:rPr>
                 <w:sz w:val="18"/>
               </w:rPr>
+              <w:t>https://drive.google.com/drive/folders/1-MXbUUIzaLoRXwR0zpv3AimCbWY6mmsh</w:t>
             </w:r>
           </w:p>
         </w:tc>
@@ -4438,6 +4450,7 @@
               <w:rPr>
                 <w:sz w:val="18"/>
               </w:rPr>
+              <w:t>https://drive.google.com/drive/folders/1vcn9quyhrUzpmk0w1-0k-B5FsIZ77GHT</w:t>
             </w:r>
           </w:p>
         </w:tc>
@@ -4541,6 +4554,7 @@
               <w:rPr>
                 <w:sz w:val="18"/>
               </w:rPr>
+              <w:t>https://drive.google.com/drive/folders/1t5UxZx3QIaPlOzTV_-YVgXMemTKtZy_n</w:t>
             </w:r>
           </w:p>
         </w:tc>
@@ -4644,6 +4658,7 @@
               <w:rPr>
                 <w:sz w:val="18"/>
               </w:rPr>
+              <w:t>https://drive.google.com/drive/folders/1rYV2iZAKHtHUEgizX5hSZCtgxVbHyk8S</w:t>
             </w:r>
           </w:p>
         </w:tc>
@@ -4747,6 +4762,7 @@
               <w:rPr>
                 <w:sz w:val="18"/>
               </w:rPr>
+              <w:t>https://drive.google.com/drive/folders/14VD2B7lDPHF6c6J2mFrB7SiSUfXGXsO8</w:t>
             </w:r>
           </w:p>
         </w:tc>
@@ -4850,6 +4866,7 @@
               <w:rPr>
                 <w:sz w:val="18"/>
               </w:rPr>
+              <w:t>https://drive.google.com/drive/folders/1djG47lwZFUgu-uA2uH_d3kDI84a7TMh9</w:t>
             </w:r>
           </w:p>
         </w:tc>
@@ -4953,6 +4970,7 @@
               <w:rPr>
                 <w:sz w:val="18"/>
               </w:rPr>
+              <w:t>https://drive.google.com/drive/folders/1hPfXMkj2oznQfhaDjWTrBgCCouxWEEYR</w:t>
             </w:r>
           </w:p>
         </w:tc>
@@ -5056,6 +5074,7 @@
               <w:rPr>
                 <w:sz w:val="18"/>
               </w:rPr>
+              <w:t>https://drive.google.com/drive/folders/19kAW2h213yW-W6w01lwz9Q8zbmfPEhbN</w:t>
             </w:r>
           </w:p>
         </w:tc>
@@ -5328,6 +5347,7 @@
               <w:rPr>
                 <w:sz w:val="18"/>
               </w:rPr>
+              <w:t>https://drive.google.com/drive/folders/1RuTAClVee3t4AIWcLUUkFllufLXqHqqb</w:t>
             </w:r>
           </w:p>
         </w:tc>

</xml_diff>